<commit_message>
fix code and report
</commit_message>
<xml_diff>
--- a/Lab1/ОтчетЛаб-1.docx
+++ b/Lab1/ОтчетЛаб-1.docx
@@ -588,9 +588,11 @@
             <m:t>g(x)=0</m:t>
           </m:r>
           <m:r>
+            <m:rPr>
+              <m:sty m:val="p"/>
+            </m:rPr>
             <w:rPr>
               <w:rFonts w:ascii="Times New Roman" w:hAnsi="Times New Roman" w:cs="Times New Roman"/>
-              <w:i/>
               <w:sz w:val="28"/>
               <w:szCs w:val="28"/>
             </w:rPr>
@@ -681,23 +683,7 @@
           <w:sz w:val="28"/>
           <w:szCs w:val="28"/>
         </w:rPr>
-        <w:t>Проверяется наличие смены знака функции на концах интервала [1</w:t>
-      </w:r>
-      <w:r>
-        <w:rPr>
-          <w:rFonts w:ascii="Times New Roman" w:hAnsi="Times New Roman" w:cs="Times New Roman"/>
-          <w:sz w:val="28"/>
-          <w:szCs w:val="28"/>
-        </w:rPr>
-        <w:t xml:space="preserve">, </w:t>
-      </w:r>
-      <w:r>
-        <w:rPr>
-          <w:rFonts w:ascii="Times New Roman" w:hAnsi="Times New Roman" w:cs="Times New Roman"/>
-          <w:sz w:val="28"/>
-          <w:szCs w:val="28"/>
-        </w:rPr>
-        <w:t>2].</w:t>
+        <w:t>Проверяется наличие смены знака функции на концах интервала [1, 2].</w:t>
       </w:r>
     </w:p>
     <w:p>
@@ -764,22 +750,6 @@
           <w:szCs w:val="28"/>
         </w:rPr>
         <w:t xml:space="preserve">Процесс повторяется до достижения заданной точности </w:t>
-      </w:r>
-      <w:r>
-        <w:rPr>
-          <w:rFonts w:ascii="Times New Roman" w:hAnsi="Times New Roman" w:cs="Times New Roman"/>
-          <w:sz w:val="28"/>
-          <w:szCs w:val="28"/>
-        </w:rPr>
-        <w:t>tolerance</w:t>
-      </w:r>
-      <w:r>
-        <w:rPr>
-          <w:rFonts w:ascii="Times New Roman" w:hAnsi="Times New Roman" w:cs="Times New Roman"/>
-          <w:sz w:val="28"/>
-          <w:szCs w:val="28"/>
-        </w:rPr>
-        <w:t>=</w:t>
       </w:r>
       <m:oMath>
         <m:sSup>
@@ -1403,6 +1373,14 @@
       </m:oMath>
       <w:r>
         <w:rPr>
+          <w:rFonts w:ascii="Times New Roman" w:eastAsiaTheme="minorEastAsia" w:hAnsi="Times New Roman" w:cs="Times New Roman"/>
+          <w:sz w:val="28"/>
+          <w:szCs w:val="28"/>
+        </w:rPr>
+        <w:t xml:space="preserve"> </w:t>
+      </w:r>
+      <w:r>
+        <w:rPr>
           <w:rFonts w:ascii="Times New Roman" w:hAnsi="Times New Roman" w:cs="Times New Roman"/>
           <w:sz w:val="28"/>
           <w:szCs w:val="28"/>
@@ -1484,7 +1462,7 @@
           <w:sz w:val="28"/>
           <w:szCs w:val="28"/>
         </w:rPr>
-        <w:t>сплайна S(x),</w:t>
+        <w:t>сплайна S(x)</w:t>
       </w:r>
     </w:p>
     <w:p>
@@ -1506,7 +1484,7 @@
           <w:sz w:val="28"/>
           <w:szCs w:val="28"/>
         </w:rPr>
-        <w:t>прямой 6x + 3,</w:t>
+        <w:t>прямой 6x + 3</w:t>
       </w:r>
     </w:p>
     <w:p>
@@ -1528,7 +1506,7 @@
           <w:sz w:val="28"/>
           <w:szCs w:val="28"/>
         </w:rPr>
-        <w:t>исходных табличных узлов,</w:t>
+        <w:t>исходных табличных узлов</w:t>
       </w:r>
     </w:p>
     <w:p>
@@ -1550,7 +1528,7 @@
           <w:sz w:val="28"/>
           <w:szCs w:val="28"/>
         </w:rPr>
-        <w:t>найденного корня.</w:t>
+        <w:t>найденного корня</w:t>
       </w:r>
     </w:p>
     <w:p>
@@ -1570,16 +1548,6 @@
         </w:rPr>
         <w:t>График подтверждает, что найденная точка соответствует пересечению кривых.</w:t>
       </w:r>
-    </w:p>
-    <w:p>
-      <w:pPr>
-        <w:spacing w:after="0"/>
-        <w:rPr>
-          <w:rFonts w:ascii="Times New Roman" w:hAnsi="Times New Roman" w:cs="Times New Roman"/>
-          <w:sz w:val="32"/>
-          <w:szCs w:val="32"/>
-        </w:rPr>
-      </w:pPr>
     </w:p>
     <w:p>
       <w:pPr>
@@ -1761,23 +1729,7 @@
           <w:sz w:val="32"/>
           <w:szCs w:val="32"/>
         </w:rPr>
-        <w:t>6x*+</w:t>
-      </w:r>
-      <w:r>
-        <w:rPr>
-          <w:rFonts w:ascii="Times New Roman" w:hAnsi="Times New Roman" w:cs="Times New Roman"/>
-          <w:sz w:val="32"/>
-          <w:szCs w:val="32"/>
-        </w:rPr>
-        <w:t>3 =</w:t>
-      </w:r>
-      <w:r>
-        <w:rPr>
-          <w:rFonts w:ascii="Times New Roman" w:hAnsi="Times New Roman" w:cs="Times New Roman"/>
-          <w:sz w:val="32"/>
-          <w:szCs w:val="32"/>
-        </w:rPr>
-        <w:t xml:space="preserve"> 12.378173897223</w:t>
+        <w:t>6x*+3 = 12.378173897223</w:t>
       </w:r>
     </w:p>
     <w:p>
@@ -1820,7 +1772,6 @@
           <w:rFonts w:ascii="Times New Roman" w:hAnsi="Times New Roman" w:cs="Times New Roman"/>
           <w:sz w:val="28"/>
           <w:szCs w:val="28"/>
-          <w:lang w:val="en-US"/>
         </w:rPr>
       </w:pPr>
       <w:r>
@@ -1845,15 +1796,7 @@
           <w:sz w:val="28"/>
           <w:szCs w:val="28"/>
         </w:rPr>
-        <w:t>[1, 2]</w:t>
-      </w:r>
-      <w:r>
-        <w:rPr>
-          <w:rFonts w:ascii="Times New Roman" w:hAnsi="Times New Roman" w:cs="Times New Roman"/>
-          <w:sz w:val="28"/>
-          <w:szCs w:val="28"/>
-        </w:rPr>
-        <w:t xml:space="preserve">. Решение уравнения </w:t>
+        <w:t xml:space="preserve">[1, 2]. Решение уравнения </w:t>
       </w:r>
       <m:oMath>
         <m:r>
@@ -1862,7 +1805,7 @@
             <w:sz w:val="28"/>
             <w:szCs w:val="28"/>
           </w:rPr>
-          <m:t>S(x)=6x+3</m:t>
+          <m:t>6x+3</m:t>
         </m:r>
       </m:oMath>
       <w:r>
@@ -1889,7 +1832,6 @@
           <w:rFonts w:ascii="Times New Roman" w:hAnsi="Times New Roman" w:cs="Times New Roman"/>
           <w:sz w:val="28"/>
           <w:szCs w:val="28"/>
-          <w:lang w:val="en-US"/>
         </w:rPr>
       </w:pPr>
     </w:p>
@@ -2114,7 +2056,6 @@
           <w:rFonts w:ascii="Times New Roman" w:hAnsi="Times New Roman" w:cs="Times New Roman"/>
           <w:sz w:val="28"/>
           <w:szCs w:val="28"/>
-          <w:lang w:val="en-US"/>
         </w:rPr>
       </w:pPr>
     </w:p>
@@ -3235,7 +3176,7 @@
           <w:szCs w:val="20"/>
           <w:lang w:val="en-US" w:eastAsia="ru-RU"/>
         </w:rPr>
-        <w:t>func</w:t>
+        <w:t>function</w:t>
       </w:r>
       <w:r>
         <w:rPr>
@@ -3255,7 +3196,7 @@
           <w:szCs w:val="20"/>
           <w:lang w:val="en-US" w:eastAsia="ru-RU"/>
         </w:rPr>
-        <w:t>lo</w:t>
+        <w:t>left_bound</w:t>
       </w:r>
       <w:r>
         <w:rPr>
@@ -3275,7 +3216,7 @@
           <w:szCs w:val="20"/>
           <w:lang w:val="en-US" w:eastAsia="ru-RU"/>
         </w:rPr>
-        <w:t>hi</w:t>
+        <w:t>right_bound</w:t>
       </w:r>
       <w:r>
         <w:rPr>
@@ -3295,7 +3236,7 @@
           <w:szCs w:val="20"/>
           <w:lang w:val="en-US" w:eastAsia="ru-RU"/>
         </w:rPr>
-        <w:t>tol</w:t>
+        <w:t>tolerance</w:t>
       </w:r>
       <w:r>
         <w:rPr>
@@ -3335,7 +3276,7 @@
           <w:szCs w:val="20"/>
           <w:lang w:val="en-US" w:eastAsia="ru-RU"/>
         </w:rPr>
-        <w:t>max_iter</w:t>
+        <w:t>max_iterations</w:t>
       </w:r>
       <w:r>
         <w:rPr>
@@ -3396,7 +3337,7 @@
           <w:szCs w:val="20"/>
           <w:lang w:val="en-US" w:eastAsia="ru-RU"/>
         </w:rPr>
-        <w:t xml:space="preserve">f_lo </w:t>
+        <w:t xml:space="preserve">f_left </w:t>
       </w:r>
       <w:r>
         <w:rPr>
@@ -3416,7 +3357,7 @@
           <w:szCs w:val="20"/>
           <w:lang w:val="en-US" w:eastAsia="ru-RU"/>
         </w:rPr>
-        <w:t>func</w:t>
+        <w:t>function</w:t>
       </w:r>
       <w:r>
         <w:rPr>
@@ -3436,7 +3377,7 @@
           <w:szCs w:val="20"/>
           <w:lang w:val="en-US" w:eastAsia="ru-RU"/>
         </w:rPr>
-        <w:t>lo</w:t>
+        <w:t>left_bound</w:t>
       </w:r>
       <w:r>
         <w:rPr>
@@ -3467,7 +3408,7 @@
           <w:szCs w:val="20"/>
           <w:lang w:val="en-US" w:eastAsia="ru-RU"/>
         </w:rPr>
-        <w:t xml:space="preserve">f_hi </w:t>
+        <w:t xml:space="preserve">f_right </w:t>
       </w:r>
       <w:r>
         <w:rPr>
@@ -3487,7 +3428,7 @@
           <w:szCs w:val="20"/>
           <w:lang w:val="en-US" w:eastAsia="ru-RU"/>
         </w:rPr>
-        <w:t>func</w:t>
+        <w:t>function</w:t>
       </w:r>
       <w:r>
         <w:rPr>
@@ -3507,7 +3448,7 @@
           <w:szCs w:val="20"/>
           <w:lang w:val="en-US" w:eastAsia="ru-RU"/>
         </w:rPr>
-        <w:t>hi</w:t>
+        <w:t>right_bound</w:t>
       </w:r>
       <w:r>
         <w:rPr>
@@ -3558,7 +3499,7 @@
           <w:szCs w:val="20"/>
           <w:lang w:val="en-US" w:eastAsia="ru-RU"/>
         </w:rPr>
-        <w:t xml:space="preserve">f_lo </w:t>
+        <w:t xml:space="preserve">f_left </w:t>
       </w:r>
       <w:r>
         <w:rPr>
@@ -3609,7 +3550,7 @@
           <w:szCs w:val="20"/>
           <w:lang w:val="en-US" w:eastAsia="ru-RU"/>
         </w:rPr>
-        <w:t>lo</w:t>
+        <w:t>left_bound</w:t>
       </w:r>
       <w:r>
         <w:rPr>
@@ -3660,7 +3601,7 @@
           <w:szCs w:val="20"/>
           <w:lang w:val="en-US" w:eastAsia="ru-RU"/>
         </w:rPr>
-        <w:t xml:space="preserve">f_hi </w:t>
+        <w:t xml:space="preserve">f_right </w:t>
       </w:r>
       <w:r>
         <w:rPr>
@@ -3706,12 +3647,12 @@
       <w:r>
         <w:rPr>
           <w:rFonts w:ascii="Courier New" w:eastAsia="Times New Roman" w:hAnsi="Courier New" w:cs="Courier New"/>
-          <w:color w:val="005CC5"/>
-          <w:sz w:val="20"/>
-          <w:szCs w:val="20"/>
-          <w:lang w:val="en-US" w:eastAsia="ru-RU"/>
-        </w:rPr>
-        <w:t>hi</w:t>
+          <w:color w:val="E36209"/>
+          <w:sz w:val="20"/>
+          <w:szCs w:val="20"/>
+          <w:lang w:val="en-US" w:eastAsia="ru-RU"/>
+        </w:rPr>
+        <w:t>right_bound</w:t>
       </w:r>
       <w:r>
         <w:rPr>
@@ -3762,7 +3703,7 @@
           <w:szCs w:val="20"/>
           <w:lang w:val="en-US" w:eastAsia="ru-RU"/>
         </w:rPr>
-        <w:t xml:space="preserve">f_lo </w:t>
+        <w:t xml:space="preserve">f_left </w:t>
       </w:r>
       <w:r>
         <w:rPr>
@@ -3782,7 +3723,7 @@
           <w:szCs w:val="20"/>
           <w:lang w:val="en-US" w:eastAsia="ru-RU"/>
         </w:rPr>
-        <w:t xml:space="preserve">f_hi </w:t>
+        <w:t xml:space="preserve">f_right </w:t>
       </w:r>
       <w:r>
         <w:rPr>
@@ -3893,7 +3834,7 @@
           <w:szCs w:val="20"/>
           <w:lang w:val="en-US" w:eastAsia="ru-RU"/>
         </w:rPr>
-        <w:t xml:space="preserve"> [lo, hi] </w:t>
+        <w:t xml:space="preserve"> </w:t>
       </w:r>
       <w:r>
         <w:rPr>
@@ -3903,6 +3844,26 @@
           <w:szCs w:val="20"/>
           <w:lang w:eastAsia="ru-RU"/>
         </w:rPr>
+        <w:t>интервала</w:t>
+      </w:r>
+      <w:r>
+        <w:rPr>
+          <w:rFonts w:ascii="Courier New" w:eastAsia="Times New Roman" w:hAnsi="Courier New" w:cs="Courier New"/>
+          <w:color w:val="032F62"/>
+          <w:sz w:val="20"/>
+          <w:szCs w:val="20"/>
+          <w:lang w:val="en-US" w:eastAsia="ru-RU"/>
+        </w:rPr>
+        <w:t xml:space="preserve"> </w:t>
+      </w:r>
+      <w:r>
+        <w:rPr>
+          <w:rFonts w:ascii="Courier New" w:eastAsia="Times New Roman" w:hAnsi="Courier New" w:cs="Courier New"/>
+          <w:color w:val="032F62"/>
+          <w:sz w:val="20"/>
+          <w:szCs w:val="20"/>
+          <w:lang w:eastAsia="ru-RU"/>
+        </w:rPr>
         <w:t>нет</w:t>
       </w:r>
       <w:r>
@@ -3963,7 +3924,7 @@
           <w:szCs w:val="20"/>
           <w:lang w:eastAsia="ru-RU"/>
         </w:rPr>
-        <w:t>Бисекция</w:t>
+        <w:t>Метод</w:t>
       </w:r>
       <w:r>
         <w:rPr>
@@ -3983,7 +3944,7 @@
           <w:szCs w:val="20"/>
           <w:lang w:eastAsia="ru-RU"/>
         </w:rPr>
-        <w:t>не</w:t>
+        <w:t>бисекции</w:t>
       </w:r>
       <w:r>
         <w:rPr>
@@ -4003,7 +3964,7 @@
           <w:szCs w:val="20"/>
           <w:lang w:eastAsia="ru-RU"/>
         </w:rPr>
-        <w:t>применима</w:t>
+        <w:t>неприменим</w:t>
       </w:r>
       <w:r>
         <w:rPr>
@@ -4064,7 +4025,7 @@
           <w:szCs w:val="20"/>
           <w:lang w:val="en-US" w:eastAsia="ru-RU"/>
         </w:rPr>
-        <w:t xml:space="preserve">it </w:t>
+        <w:t xml:space="preserve">iteration </w:t>
       </w:r>
       <w:r>
         <w:rPr>
@@ -4124,7 +4085,7 @@
           <w:szCs w:val="20"/>
           <w:lang w:val="en-US" w:eastAsia="ru-RU"/>
         </w:rPr>
-        <w:t xml:space="preserve">max_iter </w:t>
+        <w:t xml:space="preserve">max_iterations </w:t>
       </w:r>
       <w:r>
         <w:rPr>
@@ -4185,7 +4146,7 @@
           <w:szCs w:val="20"/>
           <w:lang w:val="en-US" w:eastAsia="ru-RU"/>
         </w:rPr>
-        <w:t xml:space="preserve">mid </w:t>
+        <w:t xml:space="preserve">midpoint </w:t>
       </w:r>
       <w:r>
         <w:rPr>
@@ -4215,7 +4176,7 @@
           <w:szCs w:val="20"/>
           <w:lang w:val="en-US" w:eastAsia="ru-RU"/>
         </w:rPr>
-        <w:t xml:space="preserve">lo </w:t>
+        <w:t xml:space="preserve">left_bound </w:t>
       </w:r>
       <w:r>
         <w:rPr>
@@ -4235,7 +4196,7 @@
           <w:szCs w:val="20"/>
           <w:lang w:val="en-US" w:eastAsia="ru-RU"/>
         </w:rPr>
-        <w:t>hi</w:t>
+        <w:t>right_bound</w:t>
       </w:r>
       <w:r>
         <w:rPr>
@@ -4296,7 +4257,7 @@
           <w:szCs w:val="20"/>
           <w:lang w:val="en-US" w:eastAsia="ru-RU"/>
         </w:rPr>
-        <w:t>func</w:t>
+        <w:t>function</w:t>
       </w:r>
       <w:r>
         <w:rPr>
@@ -4316,7 +4277,7 @@
           <w:szCs w:val="20"/>
           <w:lang w:val="en-US" w:eastAsia="ru-RU"/>
         </w:rPr>
-        <w:t>mid</w:t>
+        <w:t>midpoint</w:t>
       </w:r>
       <w:r>
         <w:rPr>
@@ -4417,7 +4378,7 @@
           <w:szCs w:val="20"/>
           <w:lang w:val="en-US" w:eastAsia="ru-RU"/>
         </w:rPr>
-        <w:t xml:space="preserve">tol </w:t>
+        <w:t xml:space="preserve">tolerance </w:t>
       </w:r>
       <w:r>
         <w:rPr>
@@ -4447,7 +4408,7 @@
           <w:szCs w:val="20"/>
           <w:lang w:val="en-US" w:eastAsia="ru-RU"/>
         </w:rPr>
-        <w:t xml:space="preserve">hi </w:t>
+        <w:t xml:space="preserve">right_bound </w:t>
       </w:r>
       <w:r>
         <w:rPr>
@@ -4467,7 +4428,7 @@
           <w:szCs w:val="20"/>
           <w:lang w:val="en-US" w:eastAsia="ru-RU"/>
         </w:rPr>
-        <w:t>lo</w:t>
+        <w:t>left_bound</w:t>
       </w:r>
       <w:r>
         <w:rPr>
@@ -4517,7 +4478,7 @@
           <w:szCs w:val="20"/>
           <w:lang w:val="en-US" w:eastAsia="ru-RU"/>
         </w:rPr>
-        <w:t>tol</w:t>
+        <w:t>tolerance</w:t>
       </w:r>
       <w:r>
         <w:rPr>
@@ -4548,7 +4509,7 @@
           <w:szCs w:val="20"/>
           <w:lang w:val="en-US" w:eastAsia="ru-RU"/>
         </w:rPr>
-        <w:t>mid</w:t>
+        <w:t>midpoint</w:t>
       </w:r>
       <w:r>
         <w:rPr>
@@ -4568,7 +4529,7 @@
           <w:szCs w:val="20"/>
           <w:lang w:val="en-US" w:eastAsia="ru-RU"/>
         </w:rPr>
-        <w:t>it</w:t>
+        <w:t>iteration</w:t>
       </w:r>
       <w:r>
         <w:rPr>
@@ -4609,7 +4570,7 @@
           <w:szCs w:val="20"/>
           <w:lang w:val="en-US" w:eastAsia="ru-RU"/>
         </w:rPr>
-        <w:t xml:space="preserve">f_lo </w:t>
+        <w:t xml:space="preserve">f_left </w:t>
       </w:r>
       <w:r>
         <w:rPr>
@@ -4680,7 +4641,7 @@
           <w:szCs w:val="20"/>
           <w:lang w:val="en-US" w:eastAsia="ru-RU"/>
         </w:rPr>
-        <w:t xml:space="preserve">hi </w:t>
+        <w:t xml:space="preserve">right_bound </w:t>
       </w:r>
       <w:r>
         <w:rPr>
@@ -4700,7 +4661,7 @@
           <w:szCs w:val="20"/>
           <w:lang w:val="en-US" w:eastAsia="ru-RU"/>
         </w:rPr>
-        <w:t>mid</w:t>
+        <w:t>midpoint</w:t>
       </w:r>
       <w:r>
         <w:rPr>
@@ -4721,7 +4682,7 @@
           <w:szCs w:val="20"/>
           <w:lang w:val="en-US" w:eastAsia="ru-RU"/>
         </w:rPr>
-        <w:t xml:space="preserve">f_hi </w:t>
+        <w:t xml:space="preserve">f_right </w:t>
       </w:r>
       <w:r>
         <w:rPr>
@@ -4783,7 +4744,7 @@
           <w:szCs w:val="20"/>
           <w:lang w:val="en-US" w:eastAsia="ru-RU"/>
         </w:rPr>
-        <w:t xml:space="preserve">lo </w:t>
+        <w:t xml:space="preserve">left_bound </w:t>
       </w:r>
       <w:r>
         <w:rPr>
@@ -4803,7 +4764,7 @@
           <w:szCs w:val="20"/>
           <w:lang w:val="en-US" w:eastAsia="ru-RU"/>
         </w:rPr>
-        <w:t>mid</w:t>
+        <w:t>midpoint</w:t>
       </w:r>
       <w:r>
         <w:rPr>
@@ -4814,7 +4775,7 @@
           <w:lang w:val="en-US" w:eastAsia="ru-RU"/>
         </w:rPr>
         <w:br/>
-        <w:t xml:space="preserve">            f_lo </w:t>
+        <w:t xml:space="preserve">            f_left </w:t>
       </w:r>
       <w:r>
         <w:rPr>
@@ -4875,7 +4836,7 @@
           <w:szCs w:val="20"/>
           <w:lang w:val="en-US" w:eastAsia="ru-RU"/>
         </w:rPr>
-        <w:t>mid</w:t>
+        <w:t>midpoint</w:t>
       </w:r>
       <w:r>
         <w:rPr>
@@ -4895,7 +4856,7 @@
           <w:szCs w:val="20"/>
           <w:lang w:val="en-US" w:eastAsia="ru-RU"/>
         </w:rPr>
-        <w:t>max_iter</w:t>
+        <w:t>max_iterations</w:t>
       </w:r>
       <w:r>
         <w:rPr>
@@ -4925,7 +4886,7 @@
           <w:szCs w:val="20"/>
           <w:lang w:val="en-US" w:eastAsia="ru-RU"/>
         </w:rPr>
-        <w:t xml:space="preserve">root, iters </w:t>
+        <w:t xml:space="preserve">solution_x, iterations </w:t>
       </w:r>
       <w:r>
         <w:rPr>
@@ -5175,7 +5136,7 @@
           <w:szCs w:val="20"/>
           <w:lang w:val="en-US" w:eastAsia="ru-RU"/>
         </w:rPr>
-        <w:t>root</w:t>
+        <w:t>solution_x</w:t>
       </w:r>
       <w:r>
         <w:rPr>
@@ -5265,7 +5226,67 @@
           <w:szCs w:val="20"/>
           <w:lang w:val="en-US" w:eastAsia="ru-RU"/>
         </w:rPr>
-        <w:t>f"</w:t>
+        <w:t xml:space="preserve">f"S(x*) = </w:t>
+      </w:r>
+      <w:r>
+        <w:rPr>
+          <w:rFonts w:ascii="Courier New" w:eastAsia="Times New Roman" w:hAnsi="Courier New" w:cs="Courier New"/>
+          <w:color w:val="005CC5"/>
+          <w:sz w:val="20"/>
+          <w:szCs w:val="20"/>
+          <w:lang w:val="en-US" w:eastAsia="ru-RU"/>
+        </w:rPr>
+        <w:t>{</w:t>
+      </w:r>
+      <w:r>
+        <w:rPr>
+          <w:rFonts w:ascii="Courier New" w:eastAsia="Times New Roman" w:hAnsi="Courier New" w:cs="Courier New"/>
+          <w:color w:val="005CC4"/>
+          <w:sz w:val="20"/>
+          <w:szCs w:val="20"/>
+          <w:lang w:val="en-US" w:eastAsia="ru-RU"/>
+        </w:rPr>
+        <w:t>float</w:t>
+      </w:r>
+      <w:r>
+        <w:rPr>
+          <w:rFonts w:ascii="Courier New" w:eastAsia="Times New Roman" w:hAnsi="Courier New" w:cs="Courier New"/>
+          <w:color w:val="24292E"/>
+          <w:sz w:val="20"/>
+          <w:szCs w:val="20"/>
+          <w:lang w:val="en-US" w:eastAsia="ru-RU"/>
+        </w:rPr>
+        <w:t>(</w:t>
+      </w:r>
+      <w:r>
+        <w:rPr>
+          <w:rFonts w:ascii="Courier New" w:eastAsia="Times New Roman" w:hAnsi="Courier New" w:cs="Courier New"/>
+          <w:color w:val="6F42C1"/>
+          <w:sz w:val="20"/>
+          <w:szCs w:val="20"/>
+          <w:lang w:val="en-US" w:eastAsia="ru-RU"/>
+        </w:rPr>
+        <w:t>spline</w:t>
+      </w:r>
+      <w:r>
+        <w:rPr>
+          <w:rFonts w:ascii="Courier New" w:eastAsia="Times New Roman" w:hAnsi="Courier New" w:cs="Courier New"/>
+          <w:color w:val="24292E"/>
+          <w:sz w:val="20"/>
+          <w:szCs w:val="20"/>
+          <w:lang w:val="en-US" w:eastAsia="ru-RU"/>
+        </w:rPr>
+        <w:t>(solution_x))</w:t>
+      </w:r>
+      <w:r>
+        <w:rPr>
+          <w:rFonts w:ascii="Courier New" w:eastAsia="Times New Roman" w:hAnsi="Courier New" w:cs="Courier New"/>
+          <w:color w:val="005CC5"/>
+          <w:sz w:val="20"/>
+          <w:szCs w:val="20"/>
+          <w:lang w:val="en-US" w:eastAsia="ru-RU"/>
+        </w:rPr>
+        <w:t>:</w:t>
       </w:r>
       <w:r>
         <w:rPr>
@@ -5273,9 +5294,19 @@
           <w:color w:val="032F62"/>
           <w:sz w:val="20"/>
           <w:szCs w:val="20"/>
-          <w:lang w:eastAsia="ru-RU"/>
-        </w:rPr>
-        <w:t>итераций</w:t>
+          <w:lang w:val="en-US" w:eastAsia="ru-RU"/>
+        </w:rPr>
+        <w:t>.12f</w:t>
+      </w:r>
+      <w:r>
+        <w:rPr>
+          <w:rFonts w:ascii="Courier New" w:eastAsia="Times New Roman" w:hAnsi="Courier New" w:cs="Courier New"/>
+          <w:color w:val="005CC5"/>
+          <w:sz w:val="20"/>
+          <w:szCs w:val="20"/>
+          <w:lang w:val="en-US" w:eastAsia="ru-RU"/>
+        </w:rPr>
+        <w:t>}</w:t>
       </w:r>
       <w:r>
         <w:rPr>
@@ -5285,7 +5316,57 @@
           <w:szCs w:val="20"/>
           <w:lang w:val="en-US" w:eastAsia="ru-RU"/>
         </w:rPr>
-        <w:t xml:space="preserve"> = </w:t>
+        <w:t>"</w:t>
+      </w:r>
+      <w:r>
+        <w:rPr>
+          <w:rFonts w:ascii="Courier New" w:eastAsia="Times New Roman" w:hAnsi="Courier New" w:cs="Courier New"/>
+          <w:color w:val="24292E"/>
+          <w:sz w:val="20"/>
+          <w:szCs w:val="20"/>
+          <w:lang w:val="en-US" w:eastAsia="ru-RU"/>
+        </w:rPr>
+        <w:t>)</w:t>
+      </w:r>
+      <w:r>
+        <w:rPr>
+          <w:rFonts w:ascii="Courier New" w:eastAsia="Times New Roman" w:hAnsi="Courier New" w:cs="Courier New"/>
+          <w:color w:val="24292E"/>
+          <w:sz w:val="20"/>
+          <w:szCs w:val="20"/>
+          <w:lang w:val="en-US" w:eastAsia="ru-RU"/>
+        </w:rPr>
+        <w:br/>
+      </w:r>
+      <w:r>
+        <w:rPr>
+          <w:rFonts w:ascii="Courier New" w:eastAsia="Times New Roman" w:hAnsi="Courier New" w:cs="Courier New"/>
+          <w:color w:val="005CC4"/>
+          <w:sz w:val="20"/>
+          <w:szCs w:val="20"/>
+          <w:lang w:val="en-US" w:eastAsia="ru-RU"/>
+        </w:rPr>
+        <w:t>print</w:t>
+      </w:r>
+      <w:r>
+        <w:rPr>
+          <w:rFonts w:ascii="Courier New" w:eastAsia="Times New Roman" w:hAnsi="Courier New" w:cs="Courier New"/>
+          <w:color w:val="24292E"/>
+          <w:sz w:val="20"/>
+          <w:szCs w:val="20"/>
+          <w:lang w:val="en-US" w:eastAsia="ru-RU"/>
+        </w:rPr>
+        <w:t>(</w:t>
+      </w:r>
+      <w:r>
+        <w:rPr>
+          <w:rFonts w:ascii="Courier New" w:eastAsia="Times New Roman" w:hAnsi="Courier New" w:cs="Courier New"/>
+          <w:color w:val="032F62"/>
+          <w:sz w:val="20"/>
+          <w:szCs w:val="20"/>
+          <w:lang w:val="en-US" w:eastAsia="ru-RU"/>
+        </w:rPr>
+        <w:t xml:space="preserve">f"6x*+3 = </w:t>
       </w:r>
       <w:r>
         <w:rPr>
@@ -5305,7 +5386,7 @@
           <w:szCs w:val="20"/>
           <w:lang w:val="en-US" w:eastAsia="ru-RU"/>
         </w:rPr>
-        <w:t>iters</w:t>
+        <w:t>(</w:t>
       </w:r>
       <w:r>
         <w:rPr>
@@ -5315,7 +5396,67 @@
           <w:szCs w:val="20"/>
           <w:lang w:val="en-US" w:eastAsia="ru-RU"/>
         </w:rPr>
-        <w:t>}</w:t>
+        <w:t>6</w:t>
+      </w:r>
+      <w:r>
+        <w:rPr>
+          <w:rFonts w:ascii="Courier New" w:eastAsia="Times New Roman" w:hAnsi="Courier New" w:cs="Courier New"/>
+          <w:color w:val="D73A49"/>
+          <w:sz w:val="20"/>
+          <w:szCs w:val="20"/>
+          <w:lang w:val="en-US" w:eastAsia="ru-RU"/>
+        </w:rPr>
+        <w:t>*</w:t>
+      </w:r>
+      <w:r>
+        <w:rPr>
+          <w:rFonts w:ascii="Courier New" w:eastAsia="Times New Roman" w:hAnsi="Courier New" w:cs="Courier New"/>
+          <w:color w:val="24292E"/>
+          <w:sz w:val="20"/>
+          <w:szCs w:val="20"/>
+          <w:lang w:val="en-US" w:eastAsia="ru-RU"/>
+        </w:rPr>
+        <w:t>solution_x</w:t>
+      </w:r>
+      <w:r>
+        <w:rPr>
+          <w:rFonts w:ascii="Courier New" w:eastAsia="Times New Roman" w:hAnsi="Courier New" w:cs="Courier New"/>
+          <w:color w:val="D73A49"/>
+          <w:sz w:val="20"/>
+          <w:szCs w:val="20"/>
+          <w:lang w:val="en-US" w:eastAsia="ru-RU"/>
+        </w:rPr>
+        <w:t>+</w:t>
+      </w:r>
+      <w:r>
+        <w:rPr>
+          <w:rFonts w:ascii="Courier New" w:eastAsia="Times New Roman" w:hAnsi="Courier New" w:cs="Courier New"/>
+          <w:color w:val="005CC5"/>
+          <w:sz w:val="20"/>
+          <w:szCs w:val="20"/>
+          <w:lang w:val="en-US" w:eastAsia="ru-RU"/>
+        </w:rPr>
+        <w:t>3</w:t>
+      </w:r>
+      <w:r>
+        <w:rPr>
+          <w:rFonts w:ascii="Courier New" w:eastAsia="Times New Roman" w:hAnsi="Courier New" w:cs="Courier New"/>
+          <w:color w:val="24292E"/>
+          <w:sz w:val="20"/>
+          <w:szCs w:val="20"/>
+          <w:lang w:val="en-US" w:eastAsia="ru-RU"/>
+        </w:rPr>
+        <w:t>)</w:t>
+      </w:r>
+      <w:r>
+        <w:rPr>
+          <w:rFonts w:ascii="Courier New" w:eastAsia="Times New Roman" w:hAnsi="Courier New" w:cs="Courier New"/>
+          <w:color w:val="005CC5"/>
+          <w:sz w:val="20"/>
+          <w:szCs w:val="20"/>
+          <w:lang w:val="en-US" w:eastAsia="ru-RU"/>
+        </w:rPr>
+        <w:t>:</w:t>
       </w:r>
       <w:r>
         <w:rPr>
@@ -5325,437 +5466,7 @@
           <w:szCs w:val="20"/>
           <w:lang w:val="en-US" w:eastAsia="ru-RU"/>
         </w:rPr>
-        <w:t>"</w:t>
-      </w:r>
-      <w:r>
-        <w:rPr>
-          <w:rFonts w:ascii="Courier New" w:eastAsia="Times New Roman" w:hAnsi="Courier New" w:cs="Courier New"/>
-          <w:color w:val="24292E"/>
-          <w:sz w:val="20"/>
-          <w:szCs w:val="20"/>
-          <w:lang w:val="en-US" w:eastAsia="ru-RU"/>
-        </w:rPr>
-        <w:t>)</w:t>
-      </w:r>
-      <w:r>
-        <w:rPr>
-          <w:rFonts w:ascii="Courier New" w:eastAsia="Times New Roman" w:hAnsi="Courier New" w:cs="Courier New"/>
-          <w:color w:val="24292E"/>
-          <w:sz w:val="20"/>
-          <w:szCs w:val="20"/>
-          <w:lang w:val="en-US" w:eastAsia="ru-RU"/>
-        </w:rPr>
-        <w:br/>
-      </w:r>
-      <w:r>
-        <w:rPr>
-          <w:rFonts w:ascii="Courier New" w:eastAsia="Times New Roman" w:hAnsi="Courier New" w:cs="Courier New"/>
-          <w:color w:val="005CC4"/>
-          <w:sz w:val="20"/>
-          <w:szCs w:val="20"/>
-          <w:lang w:val="en-US" w:eastAsia="ru-RU"/>
-        </w:rPr>
-        <w:t>print</w:t>
-      </w:r>
-      <w:r>
-        <w:rPr>
-          <w:rFonts w:ascii="Courier New" w:eastAsia="Times New Roman" w:hAnsi="Courier New" w:cs="Courier New"/>
-          <w:color w:val="24292E"/>
-          <w:sz w:val="20"/>
-          <w:szCs w:val="20"/>
-          <w:lang w:val="en-US" w:eastAsia="ru-RU"/>
-        </w:rPr>
-        <w:t>(</w:t>
-      </w:r>
-      <w:r>
-        <w:rPr>
-          <w:rFonts w:ascii="Courier New" w:eastAsia="Times New Roman" w:hAnsi="Courier New" w:cs="Courier New"/>
-          <w:color w:val="032F62"/>
-          <w:sz w:val="20"/>
-          <w:szCs w:val="20"/>
-          <w:lang w:val="en-US" w:eastAsia="ru-RU"/>
-        </w:rPr>
-        <w:t xml:space="preserve">f"S(x*) = </w:t>
-      </w:r>
-      <w:r>
-        <w:rPr>
-          <w:rFonts w:ascii="Courier New" w:eastAsia="Times New Roman" w:hAnsi="Courier New" w:cs="Courier New"/>
-          <w:color w:val="005CC5"/>
-          <w:sz w:val="20"/>
-          <w:szCs w:val="20"/>
-          <w:lang w:val="en-US" w:eastAsia="ru-RU"/>
-        </w:rPr>
-        <w:t>{</w:t>
-      </w:r>
-      <w:r>
-        <w:rPr>
-          <w:rFonts w:ascii="Courier New" w:eastAsia="Times New Roman" w:hAnsi="Courier New" w:cs="Courier New"/>
-          <w:color w:val="005CC4"/>
-          <w:sz w:val="20"/>
-          <w:szCs w:val="20"/>
-          <w:lang w:val="en-US" w:eastAsia="ru-RU"/>
-        </w:rPr>
-        <w:t>float</w:t>
-      </w:r>
-      <w:r>
-        <w:rPr>
-          <w:rFonts w:ascii="Courier New" w:eastAsia="Times New Roman" w:hAnsi="Courier New" w:cs="Courier New"/>
-          <w:color w:val="24292E"/>
-          <w:sz w:val="20"/>
-          <w:szCs w:val="20"/>
-          <w:lang w:val="en-US" w:eastAsia="ru-RU"/>
-        </w:rPr>
-        <w:t>(</w:t>
-      </w:r>
-      <w:r>
-        <w:rPr>
-          <w:rFonts w:ascii="Courier New" w:eastAsia="Times New Roman" w:hAnsi="Courier New" w:cs="Courier New"/>
-          <w:color w:val="6F42C1"/>
-          <w:sz w:val="20"/>
-          <w:szCs w:val="20"/>
-          <w:lang w:val="en-US" w:eastAsia="ru-RU"/>
-        </w:rPr>
-        <w:t>spline</w:t>
-      </w:r>
-      <w:r>
-        <w:rPr>
-          <w:rFonts w:ascii="Courier New" w:eastAsia="Times New Roman" w:hAnsi="Courier New" w:cs="Courier New"/>
-          <w:color w:val="24292E"/>
-          <w:sz w:val="20"/>
-          <w:szCs w:val="20"/>
-          <w:lang w:val="en-US" w:eastAsia="ru-RU"/>
-        </w:rPr>
-        <w:t>(root))</w:t>
-      </w:r>
-      <w:r>
-        <w:rPr>
-          <w:rFonts w:ascii="Courier New" w:eastAsia="Times New Roman" w:hAnsi="Courier New" w:cs="Courier New"/>
-          <w:color w:val="005CC5"/>
-          <w:sz w:val="20"/>
-          <w:szCs w:val="20"/>
-          <w:lang w:val="en-US" w:eastAsia="ru-RU"/>
-        </w:rPr>
-        <w:t>:</w:t>
-      </w:r>
-      <w:r>
-        <w:rPr>
-          <w:rFonts w:ascii="Courier New" w:eastAsia="Times New Roman" w:hAnsi="Courier New" w:cs="Courier New"/>
-          <w:color w:val="032F62"/>
-          <w:sz w:val="20"/>
-          <w:szCs w:val="20"/>
-          <w:lang w:val="en-US" w:eastAsia="ru-RU"/>
-        </w:rPr>
         <w:t>.12f</w:t>
-      </w:r>
-      <w:r>
-        <w:rPr>
-          <w:rFonts w:ascii="Courier New" w:eastAsia="Times New Roman" w:hAnsi="Courier New" w:cs="Courier New"/>
-          <w:color w:val="005CC5"/>
-          <w:sz w:val="20"/>
-          <w:szCs w:val="20"/>
-          <w:lang w:val="en-US" w:eastAsia="ru-RU"/>
-        </w:rPr>
-        <w:t>}</w:t>
-      </w:r>
-      <w:r>
-        <w:rPr>
-          <w:rFonts w:ascii="Courier New" w:eastAsia="Times New Roman" w:hAnsi="Courier New" w:cs="Courier New"/>
-          <w:color w:val="032F62"/>
-          <w:sz w:val="20"/>
-          <w:szCs w:val="20"/>
-          <w:lang w:val="en-US" w:eastAsia="ru-RU"/>
-        </w:rPr>
-        <w:t>"</w:t>
-      </w:r>
-      <w:r>
-        <w:rPr>
-          <w:rFonts w:ascii="Courier New" w:eastAsia="Times New Roman" w:hAnsi="Courier New" w:cs="Courier New"/>
-          <w:color w:val="24292E"/>
-          <w:sz w:val="20"/>
-          <w:szCs w:val="20"/>
-          <w:lang w:val="en-US" w:eastAsia="ru-RU"/>
-        </w:rPr>
-        <w:t>)</w:t>
-      </w:r>
-      <w:r>
-        <w:rPr>
-          <w:rFonts w:ascii="Courier New" w:eastAsia="Times New Roman" w:hAnsi="Courier New" w:cs="Courier New"/>
-          <w:color w:val="24292E"/>
-          <w:sz w:val="20"/>
-          <w:szCs w:val="20"/>
-          <w:lang w:val="en-US" w:eastAsia="ru-RU"/>
-        </w:rPr>
-        <w:br/>
-      </w:r>
-      <w:r>
-        <w:rPr>
-          <w:rFonts w:ascii="Courier New" w:eastAsia="Times New Roman" w:hAnsi="Courier New" w:cs="Courier New"/>
-          <w:color w:val="005CC4"/>
-          <w:sz w:val="20"/>
-          <w:szCs w:val="20"/>
-          <w:lang w:val="en-US" w:eastAsia="ru-RU"/>
-        </w:rPr>
-        <w:t>print</w:t>
-      </w:r>
-      <w:r>
-        <w:rPr>
-          <w:rFonts w:ascii="Courier New" w:eastAsia="Times New Roman" w:hAnsi="Courier New" w:cs="Courier New"/>
-          <w:color w:val="24292E"/>
-          <w:sz w:val="20"/>
-          <w:szCs w:val="20"/>
-          <w:lang w:val="en-US" w:eastAsia="ru-RU"/>
-        </w:rPr>
-        <w:t>(</w:t>
-      </w:r>
-      <w:r>
-        <w:rPr>
-          <w:rFonts w:ascii="Courier New" w:eastAsia="Times New Roman" w:hAnsi="Courier New" w:cs="Courier New"/>
-          <w:color w:val="032F62"/>
-          <w:sz w:val="20"/>
-          <w:szCs w:val="20"/>
-          <w:lang w:val="en-US" w:eastAsia="ru-RU"/>
-        </w:rPr>
-        <w:t xml:space="preserve">f"6x*+3  = </w:t>
-      </w:r>
-      <w:r>
-        <w:rPr>
-          <w:rFonts w:ascii="Courier New" w:eastAsia="Times New Roman" w:hAnsi="Courier New" w:cs="Courier New"/>
-          <w:color w:val="005CC5"/>
-          <w:sz w:val="20"/>
-          <w:szCs w:val="20"/>
-          <w:lang w:val="en-US" w:eastAsia="ru-RU"/>
-        </w:rPr>
-        <w:t>{</w:t>
-      </w:r>
-      <w:r>
-        <w:rPr>
-          <w:rFonts w:ascii="Courier New" w:eastAsia="Times New Roman" w:hAnsi="Courier New" w:cs="Courier New"/>
-          <w:color w:val="24292E"/>
-          <w:sz w:val="20"/>
-          <w:szCs w:val="20"/>
-          <w:lang w:val="en-US" w:eastAsia="ru-RU"/>
-        </w:rPr>
-        <w:t>(</w:t>
-      </w:r>
-      <w:r>
-        <w:rPr>
-          <w:rFonts w:ascii="Courier New" w:eastAsia="Times New Roman" w:hAnsi="Courier New" w:cs="Courier New"/>
-          <w:color w:val="005CC5"/>
-          <w:sz w:val="20"/>
-          <w:szCs w:val="20"/>
-          <w:lang w:val="en-US" w:eastAsia="ru-RU"/>
-        </w:rPr>
-        <w:t>6</w:t>
-      </w:r>
-      <w:r>
-        <w:rPr>
-          <w:rFonts w:ascii="Courier New" w:eastAsia="Times New Roman" w:hAnsi="Courier New" w:cs="Courier New"/>
-          <w:color w:val="D73A49"/>
-          <w:sz w:val="20"/>
-          <w:szCs w:val="20"/>
-          <w:lang w:val="en-US" w:eastAsia="ru-RU"/>
-        </w:rPr>
-        <w:t>*</w:t>
-      </w:r>
-      <w:r>
-        <w:rPr>
-          <w:rFonts w:ascii="Courier New" w:eastAsia="Times New Roman" w:hAnsi="Courier New" w:cs="Courier New"/>
-          <w:color w:val="24292E"/>
-          <w:sz w:val="20"/>
-          <w:szCs w:val="20"/>
-          <w:lang w:val="en-US" w:eastAsia="ru-RU"/>
-        </w:rPr>
-        <w:t>root</w:t>
-      </w:r>
-      <w:r>
-        <w:rPr>
-          <w:rFonts w:ascii="Courier New" w:eastAsia="Times New Roman" w:hAnsi="Courier New" w:cs="Courier New"/>
-          <w:color w:val="D73A49"/>
-          <w:sz w:val="20"/>
-          <w:szCs w:val="20"/>
-          <w:lang w:val="en-US" w:eastAsia="ru-RU"/>
-        </w:rPr>
-        <w:t>+</w:t>
-      </w:r>
-      <w:r>
-        <w:rPr>
-          <w:rFonts w:ascii="Courier New" w:eastAsia="Times New Roman" w:hAnsi="Courier New" w:cs="Courier New"/>
-          <w:color w:val="005CC5"/>
-          <w:sz w:val="20"/>
-          <w:szCs w:val="20"/>
-          <w:lang w:val="en-US" w:eastAsia="ru-RU"/>
-        </w:rPr>
-        <w:t>3</w:t>
-      </w:r>
-      <w:r>
-        <w:rPr>
-          <w:rFonts w:ascii="Courier New" w:eastAsia="Times New Roman" w:hAnsi="Courier New" w:cs="Courier New"/>
-          <w:color w:val="24292E"/>
-          <w:sz w:val="20"/>
-          <w:szCs w:val="20"/>
-          <w:lang w:val="en-US" w:eastAsia="ru-RU"/>
-        </w:rPr>
-        <w:t>)</w:t>
-      </w:r>
-      <w:r>
-        <w:rPr>
-          <w:rFonts w:ascii="Courier New" w:eastAsia="Times New Roman" w:hAnsi="Courier New" w:cs="Courier New"/>
-          <w:color w:val="005CC5"/>
-          <w:sz w:val="20"/>
-          <w:szCs w:val="20"/>
-          <w:lang w:val="en-US" w:eastAsia="ru-RU"/>
-        </w:rPr>
-        <w:t>:</w:t>
-      </w:r>
-      <w:r>
-        <w:rPr>
-          <w:rFonts w:ascii="Courier New" w:eastAsia="Times New Roman" w:hAnsi="Courier New" w:cs="Courier New"/>
-          <w:color w:val="032F62"/>
-          <w:sz w:val="20"/>
-          <w:szCs w:val="20"/>
-          <w:lang w:val="en-US" w:eastAsia="ru-RU"/>
-        </w:rPr>
-        <w:t>.12f</w:t>
-      </w:r>
-      <w:r>
-        <w:rPr>
-          <w:rFonts w:ascii="Courier New" w:eastAsia="Times New Roman" w:hAnsi="Courier New" w:cs="Courier New"/>
-          <w:color w:val="005CC5"/>
-          <w:sz w:val="20"/>
-          <w:szCs w:val="20"/>
-          <w:lang w:val="en-US" w:eastAsia="ru-RU"/>
-        </w:rPr>
-        <w:t>}</w:t>
-      </w:r>
-      <w:r>
-        <w:rPr>
-          <w:rFonts w:ascii="Courier New" w:eastAsia="Times New Roman" w:hAnsi="Courier New" w:cs="Courier New"/>
-          <w:color w:val="032F62"/>
-          <w:sz w:val="20"/>
-          <w:szCs w:val="20"/>
-          <w:lang w:val="en-US" w:eastAsia="ru-RU"/>
-        </w:rPr>
-        <w:t>"</w:t>
-      </w:r>
-      <w:r>
-        <w:rPr>
-          <w:rFonts w:ascii="Courier New" w:eastAsia="Times New Roman" w:hAnsi="Courier New" w:cs="Courier New"/>
-          <w:color w:val="24292E"/>
-          <w:sz w:val="20"/>
-          <w:szCs w:val="20"/>
-          <w:lang w:val="en-US" w:eastAsia="ru-RU"/>
-        </w:rPr>
-        <w:t>)</w:t>
-      </w:r>
-      <w:r>
-        <w:rPr>
-          <w:rFonts w:ascii="Courier New" w:eastAsia="Times New Roman" w:hAnsi="Courier New" w:cs="Courier New"/>
-          <w:color w:val="24292E"/>
-          <w:sz w:val="20"/>
-          <w:szCs w:val="20"/>
-          <w:lang w:val="en-US" w:eastAsia="ru-RU"/>
-        </w:rPr>
-        <w:br/>
-      </w:r>
-      <w:r>
-        <w:rPr>
-          <w:rFonts w:ascii="Courier New" w:eastAsia="Times New Roman" w:hAnsi="Courier New" w:cs="Courier New"/>
-          <w:color w:val="005CC4"/>
-          <w:sz w:val="20"/>
-          <w:szCs w:val="20"/>
-          <w:lang w:val="en-US" w:eastAsia="ru-RU"/>
-        </w:rPr>
-        <w:t>print</w:t>
-      </w:r>
-      <w:r>
-        <w:rPr>
-          <w:rFonts w:ascii="Courier New" w:eastAsia="Times New Roman" w:hAnsi="Courier New" w:cs="Courier New"/>
-          <w:color w:val="24292E"/>
-          <w:sz w:val="20"/>
-          <w:szCs w:val="20"/>
-          <w:lang w:val="en-US" w:eastAsia="ru-RU"/>
-        </w:rPr>
-        <w:t>(</w:t>
-      </w:r>
-      <w:r>
-        <w:rPr>
-          <w:rFonts w:ascii="Courier New" w:eastAsia="Times New Roman" w:hAnsi="Courier New" w:cs="Courier New"/>
-          <w:color w:val="032F62"/>
-          <w:sz w:val="20"/>
-          <w:szCs w:val="20"/>
-          <w:lang w:val="en-US" w:eastAsia="ru-RU"/>
-        </w:rPr>
-        <w:t>f"</w:t>
-      </w:r>
-      <w:r>
-        <w:rPr>
-          <w:rFonts w:ascii="Courier New" w:eastAsia="Times New Roman" w:hAnsi="Courier New" w:cs="Courier New"/>
-          <w:color w:val="032F62"/>
-          <w:sz w:val="20"/>
-          <w:szCs w:val="20"/>
-          <w:lang w:eastAsia="ru-RU"/>
-        </w:rPr>
-        <w:t>невязка</w:t>
-      </w:r>
-      <w:r>
-        <w:rPr>
-          <w:rFonts w:ascii="Courier New" w:eastAsia="Times New Roman" w:hAnsi="Courier New" w:cs="Courier New"/>
-          <w:color w:val="032F62"/>
-          <w:sz w:val="20"/>
-          <w:szCs w:val="20"/>
-          <w:lang w:val="en-US" w:eastAsia="ru-RU"/>
-        </w:rPr>
-        <w:t xml:space="preserve"> g(x*) = </w:t>
-      </w:r>
-      <w:r>
-        <w:rPr>
-          <w:rFonts w:ascii="Courier New" w:eastAsia="Times New Roman" w:hAnsi="Courier New" w:cs="Courier New"/>
-          <w:color w:val="005CC5"/>
-          <w:sz w:val="20"/>
-          <w:szCs w:val="20"/>
-          <w:lang w:val="en-US" w:eastAsia="ru-RU"/>
-        </w:rPr>
-        <w:t>{</w:t>
-      </w:r>
-      <w:r>
-        <w:rPr>
-          <w:rFonts w:ascii="Courier New" w:eastAsia="Times New Roman" w:hAnsi="Courier New" w:cs="Courier New"/>
-          <w:color w:val="6F42C1"/>
-          <w:sz w:val="20"/>
-          <w:szCs w:val="20"/>
-          <w:lang w:val="en-US" w:eastAsia="ru-RU"/>
-        </w:rPr>
-        <w:t>g</w:t>
-      </w:r>
-      <w:r>
-        <w:rPr>
-          <w:rFonts w:ascii="Courier New" w:eastAsia="Times New Roman" w:hAnsi="Courier New" w:cs="Courier New"/>
-          <w:color w:val="24292E"/>
-          <w:sz w:val="20"/>
-          <w:szCs w:val="20"/>
-          <w:lang w:val="en-US" w:eastAsia="ru-RU"/>
-        </w:rPr>
-        <w:t>(root)</w:t>
-      </w:r>
-      <w:r>
-        <w:rPr>
-          <w:rFonts w:ascii="Courier New" w:eastAsia="Times New Roman" w:hAnsi="Courier New" w:cs="Courier New"/>
-          <w:color w:val="005CC5"/>
-          <w:sz w:val="20"/>
-          <w:szCs w:val="20"/>
-          <w:lang w:val="en-US" w:eastAsia="ru-RU"/>
-        </w:rPr>
-        <w:t>:</w:t>
-      </w:r>
-      <w:r>
-        <w:rPr>
-          <w:rFonts w:ascii="Courier New" w:eastAsia="Times New Roman" w:hAnsi="Courier New" w:cs="Courier New"/>
-          <w:color w:val="032F62"/>
-          <w:sz w:val="20"/>
-          <w:szCs w:val="20"/>
-          <w:lang w:val="en-US" w:eastAsia="ru-RU"/>
-        </w:rPr>
-        <w:t>.3e</w:t>
       </w:r>
       <w:r>
         <w:rPr>
@@ -6371,7 +6082,7 @@
           <w:szCs w:val="20"/>
           <w:lang w:val="en-US" w:eastAsia="ru-RU"/>
         </w:rPr>
-        <w:t xml:space="preserve">(root, </w:t>
+        <w:t xml:space="preserve">(solution_x, </w:t>
       </w:r>
       <w:r>
         <w:rPr>
@@ -6461,7 +6172,7 @@
           <w:szCs w:val="20"/>
           <w:lang w:val="en-US" w:eastAsia="ru-RU"/>
         </w:rPr>
-        <w:t>root</w:t>
+        <w:t>solution_x</w:t>
       </w:r>
       <w:r>
         <w:rPr>
@@ -8930,6 +8641,7 @@
   <w:style w:type="character" w:default="1" w:styleId="a0">
     <w:name w:val="Default Paragraph Font"/>
     <w:uiPriority w:val="1"/>
+    <w:semiHidden/>
     <w:unhideWhenUsed/>
   </w:style>
   <w:style w:type="table" w:default="1" w:styleId="a1">

</xml_diff>